<commit_message>
feat(audits): conteo de hallazgos por gravedad en el informe
El informe ya listaba cada brecha con su gravedad (fase-3h); ahora agrega un resumen
"X mayor(es) · Y menor(es) · Z observación(es)" (countBySeverity, results.queries.ts —
misma función que GET /gaps, sin cálculo paralelo). Decidido con el usuario tras revisar
docs/05 §8: solo el informe, GET /gaps no cambia de forma.
</commit_message>
<xml_diff>
--- a/src/modules/audits/reports/assets/compliance-report.docx
+++ b/src/modules/audits/reports/assets/compliance-report.docx
@@ -39,6 +39,11 @@
     <w:p>
       <w:r>
         <w:t xml:space="preserve">Evaluados: {evaluated} · Cumplen: {meets} · Por debajo: {below} · No aplica: {notApplicable} · Pendientes: {pending}</w:t>
+      </w:r>
+    </w:p>
+    <w:p>
+      <w:r>
+        <w:t xml:space="preserve">Gravedad de las brechas: {majorCount} mayor(es) · {minorCount} menor(es) · {observationCount} observación(es)</w:t>
       </w:r>
     </w:p>
     <w:p>

</xml_diff>